<commit_message>
Soal kelas 2 sudah
</commit_message>
<xml_diff>
--- a/Soal Komputer/Kelas 2.docx
+++ b/Soal Komputer/Kelas 2.docx
@@ -2,6 +2,16 @@
 <file path=word/document.xml><?xml version="1.0" encoding="utf-8"?>
 <w:document xmlns:wpc="http://schemas.microsoft.com/office/word/2010/wordprocessingCanvas" xmlns:cx="http://schemas.microsoft.com/office/drawing/2014/chartex" xmlns:cx1="http://schemas.microsoft.com/office/drawing/2015/9/8/chartex" xmlns:cx2="http://schemas.microsoft.com/office/drawing/2015/10/21/chartex" xmlns:cx3="http://schemas.microsoft.com/office/drawing/2016/5/9/chartex" xmlns:cx4="http://schemas.microsoft.com/office/drawing/2016/5/10/chartex" xmlns:cx5="http://schemas.microsoft.com/office/drawing/2016/5/11/chartex" xmlns:cx6="http://schemas.microsoft.com/office/drawing/2016/5/12/chartex" xmlns:cx7="http://schemas.microsoft.com/office/drawing/2016/5/13/chartex" xmlns:cx8="http://schemas.microsoft.com/office/drawing/2016/5/14/chartex" xmlns:mc="http://schemas.openxmlformats.org/markup-compatibility/2006" xmlns:aink="http://schemas.microsoft.com/office/drawing/2016/ink" xmlns:am3d="http://schemas.microsoft.com/office/drawing/2017/model3d" xmlns:o="urn:schemas-microsoft-com:office:office" xmlns:r="http://schemas.openxmlformats.org/officeDocument/2006/relationships" xmlns:m="http://schemas.openxmlformats.org/officeDocument/2006/math" xmlns:v="urn:schemas-microsoft-com:vml" xmlns:wp14="http://schemas.microsoft.com/office/word/2010/wordprocessingDrawing" xmlns:wp="http://schemas.openxmlformats.org/drawingml/2006/wordprocessingDrawing" xmlns:w10="urn:schemas-microsoft-com:office:word" xmlns:w="http://schemas.openxmlformats.org/wordprocessingml/2006/main" xmlns:w14="http://schemas.microsoft.com/office/word/2010/wordml" xmlns:w15="http://schemas.microsoft.com/office/word/2012/wordml" xmlns:w16cex="http://schemas.microsoft.com/office/word/2018/wordml/cex" xmlns:w16cid="http://schemas.microsoft.com/office/word/2016/wordml/cid" xmlns:w16="http://schemas.microsoft.com/office/word/2018/wordml" xmlns:w16se="http://schemas.microsoft.com/office/word/2015/wordml/symex" xmlns:wpg="http://schemas.microsoft.com/office/word/2010/wordprocessingGroup" xmlns:wpi="http://schemas.microsoft.com/office/word/2010/wordprocessingInk" xmlns:wne="http://schemas.microsoft.com/office/word/2006/wordml" xmlns:wps="http://schemas.microsoft.com/office/word/2010/wordprocessingShape" mc:Ignorable="w14 w15 w16se w16cid w16 w16cex wp14">
   <w:body>
+    <w:p>
+      <w:proofErr w:type="gramStart"/>
+      <w:r>
+        <w:t>Nama :</w:t>
+      </w:r>
+      <w:proofErr w:type="gramEnd"/>
+      <w:r>
+        <w:t xml:space="preserve"> </w:t>
+      </w:r>
+    </w:p>
     <w:p>
       <w:r>
         <w:t>Buatkan website seperti ini:</w:t>
@@ -10,11 +20,189 @@
     <w:p>
       <w:bookmarkStart w:id="0" w:name="_GoBack"/>
       <w:bookmarkEnd w:id="0"/>
+      <w:r>
+        <w:drawing>
+          <wp:anchor distT="0" distB="0" distL="114300" distR="114300" simplePos="0" relativeHeight="251659264" behindDoc="0" locked="0" layoutInCell="1" allowOverlap="1" wp14:anchorId="12C7ED6F" wp14:editId="006BB9BC">
+            <wp:simplePos x="0" y="0"/>
+            <wp:positionH relativeFrom="margin">
+              <wp:posOffset>3343275</wp:posOffset>
+            </wp:positionH>
+            <wp:positionV relativeFrom="paragraph">
+              <wp:posOffset>2407285</wp:posOffset>
+            </wp:positionV>
+            <wp:extent cx="3387725" cy="6087547"/>
+            <wp:effectExtent l="133350" t="114300" r="155575" b="161290"/>
+            <wp:wrapNone/>
+            <wp:docPr id="2" name="Picture 2"/>
+            <wp:cNvGraphicFramePr>
+              <a:graphicFrameLocks xmlns:a="http://schemas.openxmlformats.org/drawingml/2006/main" noChangeAspect="1"/>
+            </wp:cNvGraphicFramePr>
+            <a:graphic xmlns:a="http://schemas.openxmlformats.org/drawingml/2006/main">
+              <a:graphicData uri="http://schemas.openxmlformats.org/drawingml/2006/picture">
+                <pic:pic xmlns:pic="http://schemas.openxmlformats.org/drawingml/2006/picture">
+                  <pic:nvPicPr>
+                    <pic:cNvPr id="1" name=""/>
+                    <pic:cNvPicPr/>
+                  </pic:nvPicPr>
+                  <pic:blipFill>
+                    <a:blip r:embed="rId5">
+                      <a:extLst>
+                        <a:ext uri="{28A0092B-C50C-407E-A947-70E740481C1C}">
+                          <a14:useLocalDpi xmlns:a14="http://schemas.microsoft.com/office/drawing/2010/main" val="0"/>
+                        </a:ext>
+                      </a:extLst>
+                    </a:blip>
+                    <a:stretch>
+                      <a:fillRect/>
+                    </a:stretch>
+                  </pic:blipFill>
+                  <pic:spPr>
+                    <a:xfrm>
+                      <a:off x="0" y="0"/>
+                      <a:ext cx="3387725" cy="6087547"/>
+                    </a:xfrm>
+                    <a:prstGeom prst="rect">
+                      <a:avLst/>
+                    </a:prstGeom>
+                    <a:solidFill>
+                      <a:srgbClr val="FFFFFF">
+                        <a:shade val="85000"/>
+                      </a:srgbClr>
+                    </a:solidFill>
+                    <a:ln w="88900" cap="sq">
+                      <a:solidFill>
+                        <a:srgbClr val="FFFFFF"/>
+                      </a:solidFill>
+                      <a:miter lim="800000"/>
+                    </a:ln>
+                    <a:effectLst>
+                      <a:outerShdw blurRad="55000" dist="18000" dir="5400000" algn="tl" rotWithShape="0">
+                        <a:srgbClr val="000000">
+                          <a:alpha val="40000"/>
+                        </a:srgbClr>
+                      </a:outerShdw>
+                    </a:effectLst>
+                    <a:scene3d>
+                      <a:camera prst="orthographicFront"/>
+                      <a:lightRig rig="twoPt" dir="t">
+                        <a:rot lat="0" lon="0" rev="7200000"/>
+                      </a:lightRig>
+                    </a:scene3d>
+                    <a:sp3d>
+                      <a:bevelT w="25400" h="19050"/>
+                      <a:contourClr>
+                        <a:srgbClr val="FFFFFF"/>
+                      </a:contourClr>
+                    </a:sp3d>
+                  </pic:spPr>
+                </pic:pic>
+              </a:graphicData>
+            </a:graphic>
+            <wp14:sizeRelH relativeFrom="page">
+              <wp14:pctWidth>0</wp14:pctWidth>
+            </wp14:sizeRelH>
+            <wp14:sizeRelV relativeFrom="page">
+              <wp14:pctHeight>0</wp14:pctHeight>
+            </wp14:sizeRelV>
+          </wp:anchor>
+        </w:drawing>
+      </w:r>
+      <w:r>
+        <w:drawing>
+          <wp:anchor distT="0" distB="0" distL="114300" distR="114300" simplePos="0" relativeHeight="251658240" behindDoc="0" locked="0" layoutInCell="1" allowOverlap="1" wp14:anchorId="7D02D536" wp14:editId="4D3BF7A3">
+            <wp:simplePos x="0" y="0"/>
+            <wp:positionH relativeFrom="margin">
+              <wp:align>left</wp:align>
+            </wp:positionH>
+            <wp:positionV relativeFrom="paragraph">
+              <wp:posOffset>180975</wp:posOffset>
+            </wp:positionV>
+            <wp:extent cx="3058047" cy="5656853"/>
+            <wp:effectExtent l="133350" t="114300" r="123825" b="172720"/>
+            <wp:wrapNone/>
+            <wp:docPr id="1" name="Picture 1"/>
+            <wp:cNvGraphicFramePr>
+              <a:graphicFrameLocks xmlns:a="http://schemas.openxmlformats.org/drawingml/2006/main" noChangeAspect="1"/>
+            </wp:cNvGraphicFramePr>
+            <a:graphic xmlns:a="http://schemas.openxmlformats.org/drawingml/2006/main">
+              <a:graphicData uri="http://schemas.openxmlformats.org/drawingml/2006/picture">
+                <pic:pic xmlns:pic="http://schemas.openxmlformats.org/drawingml/2006/picture">
+                  <pic:nvPicPr>
+                    <pic:cNvPr id="1" name=""/>
+                    <pic:cNvPicPr/>
+                  </pic:nvPicPr>
+                  <pic:blipFill rotWithShape="1">
+                    <a:blip r:embed="rId6">
+                      <a:extLst>
+                        <a:ext uri="{28A0092B-C50C-407E-A947-70E740481C1C}">
+                          <a14:useLocalDpi xmlns:a14="http://schemas.microsoft.com/office/drawing/2010/main" val="0"/>
+                        </a:ext>
+                      </a:extLst>
+                    </a:blip>
+                    <a:srcRect t="4337"/>
+                    <a:stretch/>
+                  </pic:blipFill>
+                  <pic:spPr bwMode="auto">
+                    <a:xfrm>
+                      <a:off x="0" y="0"/>
+                      <a:ext cx="3058047" cy="5656853"/>
+                    </a:xfrm>
+                    <a:prstGeom prst="rect">
+                      <a:avLst/>
+                    </a:prstGeom>
+                    <a:solidFill>
+                      <a:srgbClr val="FFFFFF">
+                        <a:shade val="85000"/>
+                      </a:srgbClr>
+                    </a:solidFill>
+                    <a:ln w="88900" cap="sq">
+                      <a:solidFill>
+                        <a:srgbClr val="FFFFFF"/>
+                      </a:solidFill>
+                      <a:miter lim="800000"/>
+                    </a:ln>
+                    <a:effectLst>
+                      <a:outerShdw blurRad="55000" dist="18000" dir="5400000" algn="tl" rotWithShape="0">
+                        <a:srgbClr val="000000">
+                          <a:alpha val="40000"/>
+                        </a:srgbClr>
+                      </a:outerShdw>
+                    </a:effectLst>
+                    <a:scene3d>
+                      <a:camera prst="orthographicFront"/>
+                      <a:lightRig rig="twoPt" dir="t">
+                        <a:rot lat="0" lon="0" rev="7200000"/>
+                      </a:lightRig>
+                    </a:scene3d>
+                    <a:sp3d>
+                      <a:bevelT w="25400" h="19050"/>
+                      <a:contourClr>
+                        <a:srgbClr val="FFFFFF"/>
+                      </a:contourClr>
+                    </a:sp3d>
+                    <a:extLst>
+                      <a:ext uri="{53640926-AAD7-44D8-BBD7-CCE9431645EC}">
+                        <a14:shadowObscured xmlns:a14="http://schemas.microsoft.com/office/drawing/2010/main"/>
+                      </a:ext>
+                    </a:extLst>
+                  </pic:spPr>
+                </pic:pic>
+              </a:graphicData>
+            </a:graphic>
+            <wp14:sizeRelH relativeFrom="page">
+              <wp14:pctWidth>0</wp14:pctWidth>
+            </wp14:sizeRelH>
+            <wp14:sizeRelV relativeFrom="page">
+              <wp14:pctHeight>0</wp14:pctHeight>
+            </wp14:sizeRelV>
+          </wp:anchor>
+        </w:drawing>
+      </w:r>
     </w:p>
     <w:sectPr>
       <w:type w:val="continuous"/>
-      <w:pgSz w:w="12240" w:h="15840"/>
-      <w:pgMar w:top="1440" w:right="1440" w:bottom="1440" w:left="1440" w:header="720" w:footer="720" w:gutter="0"/>
+      <w:pgSz w:w="11906" w:h="16838" w:code="9"/>
+      <w:pgMar w:top="720" w:right="720" w:bottom="720" w:left="720" w:header="720" w:footer="720" w:gutter="0"/>
       <w:cols w:space="720"/>
       <w:docGrid w:linePitch="360"/>
     </w:sectPr>

</xml_diff>